<commit_message>
Note K47 on the K48 Kennedy figure questions
K47 questions 21 and 22 use the same two Kennedy drawings as K48
questions 49 and 58 and mark the same answers, so their scan notes now
list K47 alongside K40 and K45.

Co-Authored-By: Claude Opus 5.5 <noreply@anthropic.com>
</commit_message>
<xml_diff>
--- a/Đề thi Phục Hình Tháo Lắp RHM/RHM K48.docx
+++ b/Đề thi Phục Hình Tháo Lắp RHM/RHM K48.docx
@@ -4814,7 +4814,7 @@
         <w:t xml:space="preserve">Ghi chú bản scan: </w:t>
       </w:r>
       <w:r>
-        <w:t>Đề RHM K40 (câu 48) và K45 (câu 5) dùng cùng hình và chọn đáp án này.</w:t>
+        <w:t>Đề RHM K40 (câu 48), K45 (câu 5) và K47 (câu 21) dùng cùng hình và chọn đáp án này.</w:t>
       </w:r>
     </w:p>
     <w:p>
@@ -5671,7 +5671,7 @@
         <w:t xml:space="preserve">Ghi chú bản scan: </w:t>
       </w:r>
       <w:r>
-        <w:t>Đề RHM K40 (câu 49) và K45 (câu 6) dùng cùng hình và chọn đáp án này.</w:t>
+        <w:t>Đề RHM K40 (câu 49), K45 (câu 6) và K47 (câu 22) dùng cùng hình và chọn đáp án này.</w:t>
       </w:r>
     </w:p>
     <w:p>

</xml_diff>